<commit_message>
add submission questions and new supplemental plots. nearly finished
</commit_message>
<xml_diff>
--- a/drafts/gcb_submission/CNPmeta_gcb_questions.docx
+++ b/drafts/gcb_submission/CNPmeta_gcb_questions.docx
@@ -98,7 +98,31 @@
     </w:p>
     <w:p>
       <w:r>
-        <w:t xml:space="preserve">N and P addition primarily </w:t>
+        <w:t>N</w:t>
+      </w:r>
+      <w:r>
+        <w:t>itrogen (N)</w:t>
+      </w:r>
+      <w:r>
+        <w:t xml:space="preserve"> and</w:t>
+      </w:r>
+      <w:r>
+        <w:t xml:space="preserve"> phosphorus</w:t>
+      </w:r>
+      <w:r>
+        <w:t xml:space="preserve"> </w:t>
+      </w:r>
+      <w:r>
+        <w:t>(</w:t>
+      </w:r>
+      <w:r>
+        <w:t>P</w:t>
+      </w:r>
+      <w:r>
+        <w:t>)</w:t>
+      </w:r>
+      <w:r>
+        <w:t xml:space="preserve"> addition primarily </w:t>
       </w:r>
       <w:r>
         <w:t>increased</w:t>
@@ -110,10 +134,7 @@
         <w:t xml:space="preserve">showed </w:t>
       </w:r>
       <w:r>
-        <w:t>synergistic interactions.</w:t>
-      </w:r>
-      <w:r>
-        <w:t xml:space="preserve"> </w:t>
+        <w:t xml:space="preserve">synergistic interactions. </w:t>
       </w:r>
       <w:r>
         <w:t xml:space="preserve">Plant responses to nutrient addition were often stronger in cold, dry, bright environments, in species with scavenging mycorrhizal strategies, and in species </w:t>
@@ -189,19 +210,91 @@
         <w:rPr>
           <w:color w:val="000000"/>
         </w:rPr>
-        <w:t xml:space="preserve"> N-P interactions for only a limited set of variables. By quantifying the individual and interactive effects of N and P addition across a suite of leaf and whole-plant traits</w:t>
-      </w:r>
-      <w:r>
-        <w:rPr>
-          <w:color w:val="000000"/>
-        </w:rPr>
         <w:t xml:space="preserve"> </w:t>
       </w:r>
       <w:r>
         <w:rPr>
           <w:color w:val="000000"/>
         </w:rPr>
-        <w:t>and identifying how climate and plant functional type modify these responses, this study improves understanding of plant nutrient limitation and informs C-N-P representation in terrestrial biosphere models.</w:t>
+        <w:t>nitrogen-phosphorus</w:t>
+      </w:r>
+      <w:r>
+        <w:rPr>
+          <w:color w:val="000000"/>
+        </w:rPr>
+        <w:t xml:space="preserve"> interactions for only a limited set of variables. </w:t>
+      </w:r>
+      <w:r>
+        <w:rPr>
+          <w:color w:val="000000"/>
+        </w:rPr>
+        <w:t xml:space="preserve">Using an unprecedentedly large dataset, we quantify </w:t>
+      </w:r>
+      <w:r>
+        <w:rPr>
+          <w:color w:val="000000"/>
+        </w:rPr>
+        <w:t xml:space="preserve">the individual and interactive effects of </w:t>
+      </w:r>
+      <w:r>
+        <w:rPr>
+          <w:color w:val="000000"/>
+        </w:rPr>
+        <w:t>nitrogen</w:t>
+      </w:r>
+      <w:r>
+        <w:rPr>
+          <w:color w:val="000000"/>
+        </w:rPr>
+        <w:t xml:space="preserve"> and </w:t>
+      </w:r>
+      <w:r>
+        <w:rPr>
+          <w:color w:val="000000"/>
+        </w:rPr>
+        <w:t>phosphorus</w:t>
+      </w:r>
+      <w:r>
+        <w:rPr>
+          <w:color w:val="000000"/>
+        </w:rPr>
+        <w:t xml:space="preserve"> addition across a suite of leaf and whole-plant traits</w:t>
+      </w:r>
+      <w:r>
+        <w:rPr>
+          <w:color w:val="000000"/>
+        </w:rPr>
+        <w:t xml:space="preserve"> </w:t>
+      </w:r>
+      <w:r>
+        <w:rPr>
+          <w:color w:val="000000"/>
+        </w:rPr>
+        <w:t>and identifying how climate and plant functional type modify these responses, improv</w:t>
+      </w:r>
+      <w:r>
+        <w:rPr>
+          <w:color w:val="000000"/>
+        </w:rPr>
+        <w:t>ing</w:t>
+      </w:r>
+      <w:r>
+        <w:rPr>
+          <w:color w:val="000000"/>
+        </w:rPr>
+        <w:t xml:space="preserve"> understanding of plant nutrient limitation and inform</w:t>
+      </w:r>
+      <w:r>
+        <w:rPr>
+          <w:color w:val="000000"/>
+        </w:rPr>
+        <w:t>ing</w:t>
+      </w:r>
+      <w:r>
+        <w:rPr>
+          <w:color w:val="000000"/>
+        </w:rPr>
+        <w:t xml:space="preserve"> C-N-P representation in terrestrial biosphere models.</w:t>
       </w:r>
     </w:p>
     <w:p>
@@ -240,16 +333,7 @@
         <w:t>Global Change Biology</w:t>
       </w:r>
       <w:r>
-        <w:t xml:space="preserve"> by </w:t>
-      </w:r>
-      <w:r>
-        <w:t>quantifying</w:t>
-      </w:r>
-      <w:r>
-        <w:t xml:space="preserve"> how global change drivers influence</w:t>
-      </w:r>
-      <w:r>
-        <w:t xml:space="preserve"> plant traits relevant </w:t>
+        <w:t xml:space="preserve"> by quantifying how global change drivers influence plant traits relevant </w:t>
       </w:r>
       <w:r>
         <w:t>to ecosystem function and model development. This meta-analysis addresses</w:t>
@@ -258,7 +342,13 @@
         <w:t xml:space="preserve"> how </w:t>
       </w:r>
       <w:r>
-        <w:t>N and P</w:t>
+        <w:t>nitrogen</w:t>
+      </w:r>
+      <w:r>
+        <w:t xml:space="preserve"> and </w:t>
+      </w:r>
+      <w:r>
+        <w:t>phosphorus</w:t>
       </w:r>
       <w:r>
         <w:t xml:space="preserve"> enrichment </w:t>
@@ -267,25 +357,13 @@
         <w:t xml:space="preserve">can </w:t>
       </w:r>
       <w:r>
-        <w:t xml:space="preserve">interact with </w:t>
-      </w:r>
-      <w:r>
-        <w:t xml:space="preserve">climate and plant functional type </w:t>
-      </w:r>
-      <w:r>
-        <w:t xml:space="preserve">to </w:t>
+        <w:t xml:space="preserve">interact with climate and plant functional type to </w:t>
       </w:r>
       <w:r>
         <w:t>influence global patterns of</w:t>
       </w:r>
       <w:r>
-        <w:t xml:space="preserve"> leaf nutrient content, photosynthesis, biomass production, and</w:t>
-      </w:r>
-      <w:r>
-        <w:t xml:space="preserve"> biomass</w:t>
-      </w:r>
-      <w:r>
-        <w:t xml:space="preserve"> allocation</w:t>
+        <w:t xml:space="preserve"> leaf nutrient content, photosynthesis, biomass production, and biomass allocation</w:t>
       </w:r>
       <w:r>
         <w:t>.</w:t>
@@ -358,7 +436,31 @@
         <w:rPr>
           <w:color w:val="000000"/>
         </w:rPr>
-        <w:t xml:space="preserve"> eutrophication, N-P interactions, and climate-dependent variation in the magnitude and direction of plant responses to nutrient enrichment.</w:t>
+        <w:t xml:space="preserve"> eutrophication, </w:t>
+      </w:r>
+      <w:r>
+        <w:rPr>
+          <w:color w:val="000000"/>
+        </w:rPr>
+        <w:t>nitrogen</w:t>
+      </w:r>
+      <w:r>
+        <w:rPr>
+          <w:color w:val="000000"/>
+        </w:rPr>
+        <w:t>-</w:t>
+      </w:r>
+      <w:r>
+        <w:rPr>
+          <w:color w:val="000000"/>
+        </w:rPr>
+        <w:t>phosphorus</w:t>
+      </w:r>
+      <w:r>
+        <w:rPr>
+          <w:color w:val="000000"/>
+        </w:rPr>
+        <w:t xml:space="preserve"> interactions, and climate-dependent variation in the magnitude and direction of plant responses to nutrient enrichment.</w:t>
       </w:r>
     </w:p>
     <w:p>
@@ -380,7 +482,6 @@
         </w:rPr>
       </w:pPr>
       <w:r>
-        <w:lastRenderedPageBreak/>
         <w:t>What are the three most recently published papers that are relevant to this manuscript?</w:t>
       </w:r>
     </w:p>

</xml_diff>

<commit_message>
add proof for gcb submission
</commit_message>
<xml_diff>
--- a/drafts/gcb_submission/CNPmeta_gcb_questions.docx
+++ b/drafts/gcb_submission/CNPmeta_gcb_questions.docx
@@ -17,28 +17,6 @@
           <w:color w:val="000000"/>
         </w:rPr>
         <w:t>Leaf and whole-plant responses to nitrogen and phosphorus addition are governed by climate, acquisition strategy, and additive interactions</w:t>
-      </w:r>
-    </w:p>
-    <w:p>
-      <w:pPr>
-        <w:rPr>
-          <w:b/>
-          <w:bCs/>
-          <w:color w:val="000000"/>
-        </w:rPr>
-      </w:pPr>
-    </w:p>
-    <w:p>
-      <w:r>
-        <w:rPr>
-          <w:b/>
-          <w:bCs/>
-          <w:color w:val="000000"/>
-        </w:rPr>
-        <w:t>Global Change Biology Questions (no more than 50 words for each question)</w:t>
-      </w:r>
-      <w:r>
-        <w:t xml:space="preserve"> </w:t>
       </w:r>
     </w:p>
     <w:p>
@@ -101,28 +79,16 @@
         <w:t>N</w:t>
       </w:r>
       <w:r>
-        <w:t>itrogen (N)</w:t>
-      </w:r>
-      <w:r>
-        <w:t xml:space="preserve"> and</w:t>
+        <w:t xml:space="preserve">itrogen </w:t>
+      </w:r>
+      <w:r>
+        <w:t>and</w:t>
       </w:r>
       <w:r>
         <w:t xml:space="preserve"> phosphorus</w:t>
       </w:r>
       <w:r>
-        <w:t xml:space="preserve"> </w:t>
-      </w:r>
-      <w:r>
-        <w:t>(</w:t>
-      </w:r>
-      <w:r>
-        <w:t>P</w:t>
-      </w:r>
-      <w:r>
-        <w:t>)</w:t>
-      </w:r>
-      <w:r>
-        <w:t xml:space="preserve"> addition primarily </w:t>
+        <w:t xml:space="preserve"> addition </w:t>
       </w:r>
       <w:r>
         <w:t>increased</w:t>
@@ -137,7 +103,10 @@
         <w:t xml:space="preserve">synergistic interactions. </w:t>
       </w:r>
       <w:r>
-        <w:t xml:space="preserve">Plant responses to nutrient addition were often stronger in cold, dry, bright environments, in species with scavenging mycorrhizal strategies, and in species </w:t>
+        <w:t>R</w:t>
+      </w:r>
+      <w:r>
+        <w:t xml:space="preserve">esponses to nutrient addition were stronger in cold, dry, bright environments, in species with scavenging mycorrhizal strategies, and in species </w:t>
       </w:r>
       <w:r>
         <w:t>unable</w:t>
@@ -180,31 +149,49 @@
         <w:rPr>
           <w:color w:val="000000"/>
         </w:rPr>
-        <w:t>Eutrophication and climate change are simultaneously altering terrestrial ecosystems, yet</w:t>
-      </w:r>
-      <w:r>
-        <w:rPr>
-          <w:color w:val="000000"/>
-        </w:rPr>
-        <w:t xml:space="preserve"> global syntheses </w:t>
-      </w:r>
-      <w:r>
-        <w:rPr>
-          <w:color w:val="000000"/>
-        </w:rPr>
-        <w:t>have</w:t>
-      </w:r>
-      <w:r>
-        <w:rPr>
-          <w:color w:val="000000"/>
-        </w:rPr>
-        <w:t xml:space="preserve"> quantif</w:t>
-      </w:r>
-      <w:r>
-        <w:rPr>
-          <w:color w:val="000000"/>
-        </w:rPr>
-        <w:t>ied</w:t>
+        <w:t>Using an unprecedent</w:t>
+      </w:r>
+      <w:r>
+        <w:rPr>
+          <w:color w:val="000000"/>
+        </w:rPr>
+        <w:t>ed</w:t>
+      </w:r>
+      <w:r>
+        <w:rPr>
+          <w:color w:val="000000"/>
+        </w:rPr>
+        <w:t xml:space="preserve">ly large dataset, we quantify </w:t>
+      </w:r>
+      <w:r>
+        <w:rPr>
+          <w:color w:val="000000"/>
+        </w:rPr>
+        <w:t xml:space="preserve">the individual and interactive effects of </w:t>
+      </w:r>
+      <w:r>
+        <w:rPr>
+          <w:color w:val="000000"/>
+        </w:rPr>
+        <w:t>nitrogen</w:t>
+      </w:r>
+      <w:r>
+        <w:rPr>
+          <w:color w:val="000000"/>
+        </w:rPr>
+        <w:t xml:space="preserve"> and </w:t>
+      </w:r>
+      <w:r>
+        <w:rPr>
+          <w:color w:val="000000"/>
+        </w:rPr>
+        <w:t>phosphorus</w:t>
+      </w:r>
+      <w:r>
+        <w:rPr>
+          <w:color w:val="000000"/>
+        </w:rPr>
+        <w:t xml:space="preserve"> addition across a suite of leaf and whole-plant traits</w:t>
       </w:r>
       <w:r>
         <w:rPr>
@@ -216,61 +203,7 @@
         <w:rPr>
           <w:color w:val="000000"/>
         </w:rPr>
-        <w:t>nitrogen-phosphorus</w:t>
-      </w:r>
-      <w:r>
-        <w:rPr>
-          <w:color w:val="000000"/>
-        </w:rPr>
-        <w:t xml:space="preserve"> interactions for only a limited set of variables. </w:t>
-      </w:r>
-      <w:r>
-        <w:rPr>
-          <w:color w:val="000000"/>
-        </w:rPr>
-        <w:t xml:space="preserve">Using an unprecedentedly large dataset, we quantify </w:t>
-      </w:r>
-      <w:r>
-        <w:rPr>
-          <w:color w:val="000000"/>
-        </w:rPr>
-        <w:t xml:space="preserve">the individual and interactive effects of </w:t>
-      </w:r>
-      <w:r>
-        <w:rPr>
-          <w:color w:val="000000"/>
-        </w:rPr>
-        <w:t>nitrogen</w:t>
-      </w:r>
-      <w:r>
-        <w:rPr>
-          <w:color w:val="000000"/>
-        </w:rPr>
-        <w:t xml:space="preserve"> and </w:t>
-      </w:r>
-      <w:r>
-        <w:rPr>
-          <w:color w:val="000000"/>
-        </w:rPr>
-        <w:t>phosphorus</w:t>
-      </w:r>
-      <w:r>
-        <w:rPr>
-          <w:color w:val="000000"/>
-        </w:rPr>
-        <w:t xml:space="preserve"> addition across a suite of leaf and whole-plant traits</w:t>
-      </w:r>
-      <w:r>
-        <w:rPr>
-          <w:color w:val="000000"/>
-        </w:rPr>
-        <w:t xml:space="preserve"> </w:t>
-      </w:r>
-      <w:r>
-        <w:rPr>
-          <w:color w:val="000000"/>
-        </w:rPr>
-        <w:t>and identifying how climate and plant functional type modify these responses, improv</w:t>
+        <w:t>and identify how climate and plant functional type modify these responses, improv</w:t>
       </w:r>
       <w:r>
         <w:rPr>
@@ -324,7 +257,7 @@
     </w:p>
     <w:p>
       <w:r>
-        <w:t xml:space="preserve">This manuscript fits within the scope of </w:t>
+        <w:t xml:space="preserve">This manuscript fits the scope of </w:t>
       </w:r>
       <w:r>
         <w:rPr>
@@ -333,7 +266,13 @@
         <w:t>Global Change Biology</w:t>
       </w:r>
       <w:r>
-        <w:t xml:space="preserve"> by quantifying how global change drivers influence plant traits relevant </w:t>
+        <w:t xml:space="preserve"> by quantifying how global change influence</w:t>
+      </w:r>
+      <w:r>
+        <w:t>s</w:t>
+      </w:r>
+      <w:r>
+        <w:t xml:space="preserve"> plant traits relevant </w:t>
       </w:r>
       <w:r>
         <w:t>to ecosystem function and model development. This meta-analysis addresses</w:t>
@@ -351,13 +290,7 @@
         <w:t>phosphorus</w:t>
       </w:r>
       <w:r>
-        <w:t xml:space="preserve"> enrichment </w:t>
-      </w:r>
-      <w:r>
-        <w:t xml:space="preserve">can </w:t>
-      </w:r>
-      <w:r>
-        <w:t xml:space="preserve">interact with climate and plant functional type to </w:t>
+        <w:t xml:space="preserve"> enrichment interact with climate and plant functional type to </w:t>
       </w:r>
       <w:r>
         <w:t>influence global patterns of</w:t>
@@ -436,7 +369,7 @@
         <w:rPr>
           <w:color w:val="000000"/>
         </w:rPr>
-        <w:t xml:space="preserve"> eutrophication, </w:t>
+        <w:t xml:space="preserve"> </w:t>
       </w:r>
       <w:r>
         <w:rPr>
@@ -460,15 +393,20 @@
         <w:rPr>
           <w:color w:val="000000"/>
         </w:rPr>
-        <w:t xml:space="preserve"> interactions, and climate-dependent variation in the magnitude and direction of plant responses to nutrient enrichment.</w:t>
-      </w:r>
-    </w:p>
-    <w:p>
-      <w:pPr>
-        <w:rPr>
-          <w:color w:val="000000"/>
-        </w:rPr>
-      </w:pPr>
+        <w:t xml:space="preserve"> interactions and climate-</w:t>
+      </w:r>
+      <w:r>
+        <w:rPr>
+          <w:color w:val="000000"/>
+        </w:rPr>
+        <w:t>driven</w:t>
+      </w:r>
+      <w:r>
+        <w:rPr>
+          <w:color w:val="000000"/>
+        </w:rPr>
+        <w:t xml:space="preserve"> variation in the magnitude and direction of plant responses to nutrient enrichment.</w:t>
+      </w:r>
     </w:p>
     <w:p>
       <w:pPr>
@@ -484,17 +422,6 @@
       <w:r>
         <w:t>What are the three most recently published papers that are relevant to this manuscript?</w:t>
       </w:r>
-    </w:p>
-    <w:p>
-      <w:pPr>
-        <w:spacing w:after="0" w:line="240" w:lineRule="auto"/>
-        <w:ind w:left="360"/>
-        <w:rPr>
-          <w:rFonts w:eastAsia="Times New Roman"/>
-          <w:kern w:val="0"/>
-          <w14:ligatures w14:val="none"/>
-        </w:rPr>
-      </w:pPr>
     </w:p>
     <w:p>
       <w:pPr>
@@ -586,7 +513,8 @@
           <w:kern w:val="0"/>
           <w14:ligatures w14:val="none"/>
         </w:rPr>
-        <w:t xml:space="preserve">Ding, B., Xu, D., Wang, S., Liu, W., &amp; Zhang, Q. (2025). Additive effects of multiple global change drivers on terrestrial nitrogen cycling worldwide. </w:t>
+        <w:lastRenderedPageBreak/>
+        <w:t xml:space="preserve">Stocker, B. D., Dong, N., Perkowski, E. A., Schneider, P. D., Xu, H., de Boer, H. J., Rebel, K. T., Smith, N. G., van Sundert, K., Wang, H., Jones, S. E., Prentice, I. C., &amp; Harrison, S. P. (2025). Empirical evidence and theoretical understanding of ecosystem carbon and nitrogen cycle interactions. </w:t>
       </w:r>
       <w:r>
         <w:rPr>
@@ -596,7 +524,7 @@
           <w:kern w:val="0"/>
           <w14:ligatures w14:val="none"/>
         </w:rPr>
-        <w:t>Global Change Biology</w:t>
+        <w:t>New Phytologist</w:t>
       </w:r>
       <w:r>
         <w:rPr>
@@ -614,92 +542,17 @@
           <w:kern w:val="0"/>
           <w14:ligatures w14:val="none"/>
         </w:rPr>
-        <w:t>31</w:t>
-      </w:r>
-      <w:r>
-        <w:rPr>
-          <w:rFonts w:eastAsia="Times New Roman"/>
-          <w:kern w:val="0"/>
-          <w14:ligatures w14:val="none"/>
-        </w:rPr>
-        <w:t xml:space="preserve">(4), 1–16. </w:t>
+        <w:t>245</w:t>
+      </w:r>
+      <w:r>
+        <w:rPr>
+          <w:rFonts w:eastAsia="Times New Roman"/>
+          <w:kern w:val="0"/>
+          <w14:ligatures w14:val="none"/>
+        </w:rPr>
+        <w:t xml:space="preserve">(1), 49–68. </w:t>
       </w:r>
       <w:hyperlink r:id="rId6" w:history="1">
-        <w:r>
-          <w:rPr>
-            <w:rStyle w:val="Hyperlink"/>
-            <w:rFonts w:eastAsia="Times New Roman"/>
-            <w:kern w:val="0"/>
-            <w14:ligatures w14:val="none"/>
-          </w:rPr>
-          <w:t>https://doi.org/10.1111/gcb.70176</w:t>
-        </w:r>
-      </w:hyperlink>
-    </w:p>
-    <w:p>
-      <w:pPr>
-        <w:spacing w:after="0" w:line="240" w:lineRule="auto"/>
-        <w:rPr>
-          <w:rFonts w:eastAsia="Times New Roman"/>
-          <w:kern w:val="0"/>
-          <w14:ligatures w14:val="none"/>
-        </w:rPr>
-      </w:pPr>
-    </w:p>
-    <w:p>
-      <w:pPr>
-        <w:spacing w:after="0" w:line="240" w:lineRule="auto"/>
-        <w:rPr>
-          <w:rFonts w:eastAsia="Times New Roman"/>
-          <w:kern w:val="0"/>
-          <w14:ligatures w14:val="none"/>
-        </w:rPr>
-      </w:pPr>
-      <w:r>
-        <w:rPr>
-          <w:rFonts w:eastAsia="Times New Roman"/>
-          <w:kern w:val="0"/>
-          <w14:ligatures w14:val="none"/>
-        </w:rPr>
-        <w:t xml:space="preserve">Stocker, B. D., Dong, N., Perkowski, E. A., Schneider, P. D., Xu, H., de Boer, H. J., Rebel, K. T., Smith, N. G., van Sundert, K., Wang, H., Jones, S. E., Prentice, I. C., &amp; Harrison, S. P. (2025). Empirical evidence and theoretical understanding of ecosystem carbon and nitrogen cycle interactions. </w:t>
-      </w:r>
-      <w:r>
-        <w:rPr>
-          <w:rFonts w:eastAsia="Times New Roman"/>
-          <w:i/>
-          <w:iCs/>
-          <w:kern w:val="0"/>
-          <w14:ligatures w14:val="none"/>
-        </w:rPr>
-        <w:t>New Phytologist</w:t>
-      </w:r>
-      <w:r>
-        <w:rPr>
-          <w:rFonts w:eastAsia="Times New Roman"/>
-          <w:kern w:val="0"/>
-          <w14:ligatures w14:val="none"/>
-        </w:rPr>
-        <w:t xml:space="preserve">, </w:t>
-      </w:r>
-      <w:r>
-        <w:rPr>
-          <w:rFonts w:eastAsia="Times New Roman"/>
-          <w:i/>
-          <w:iCs/>
-          <w:kern w:val="0"/>
-          <w14:ligatures w14:val="none"/>
-        </w:rPr>
-        <w:t>245</w:t>
-      </w:r>
-      <w:r>
-        <w:rPr>
-          <w:rFonts w:eastAsia="Times New Roman"/>
-          <w:kern w:val="0"/>
-          <w14:ligatures w14:val="none"/>
-        </w:rPr>
-        <w:t xml:space="preserve">(1), 49–68. </w:t>
-      </w:r>
-      <w:hyperlink r:id="rId7" w:history="1">
         <w:r>
           <w:rPr>
             <w:rStyle w:val="Hyperlink"/>
@@ -723,8 +576,324 @@
     </w:p>
     <w:p>
       <w:pPr>
-        <w:rPr>
-          <w:color w:val="000000"/>
+        <w:spacing w:after="0" w:line="240" w:lineRule="auto"/>
+        <w:rPr>
+          <w:rFonts w:eastAsia="Times New Roman"/>
+          <w:kern w:val="0"/>
+          <w14:ligatures w14:val="none"/>
+        </w:rPr>
+      </w:pPr>
+      <w:r>
+        <w:rPr>
+          <w:rFonts w:eastAsia="Times New Roman"/>
+          <w:kern w:val="0"/>
+          <w14:ligatures w14:val="none"/>
+        </w:rPr>
+        <w:t xml:space="preserve">Chen, Z., Dong, K., Helfenstein, J., Hui, D., Zohner, C. M., Hagedorn, F., Delgado-Baquerizo, M., Martin, A. R., Feng, J., Yang, N., Chen, X., Augusto, L., Deng, Q., Hou, E., Jiang, M., Yu, Q., Shen, H., </w:t>
+      </w:r>
+      <w:proofErr w:type="spellStart"/>
+      <w:r>
+        <w:rPr>
+          <w:rFonts w:eastAsia="Times New Roman"/>
+          <w:kern w:val="0"/>
+          <w14:ligatures w14:val="none"/>
+        </w:rPr>
+        <w:t>Sardans</w:t>
+      </w:r>
+      <w:proofErr w:type="spellEnd"/>
+      <w:r>
+        <w:rPr>
+          <w:rFonts w:eastAsia="Times New Roman"/>
+          <w:kern w:val="0"/>
+          <w14:ligatures w14:val="none"/>
+        </w:rPr>
+        <w:t xml:space="preserve">, J., </w:t>
+      </w:r>
+      <w:proofErr w:type="spellStart"/>
+      <w:r>
+        <w:rPr>
+          <w:rFonts w:eastAsia="Times New Roman"/>
+          <w:kern w:val="0"/>
+          <w14:ligatures w14:val="none"/>
+        </w:rPr>
+        <w:t>Peñuelas</w:t>
+      </w:r>
+      <w:proofErr w:type="spellEnd"/>
+      <w:r>
+        <w:rPr>
+          <w:rFonts w:eastAsia="Times New Roman"/>
+          <w:kern w:val="0"/>
+          <w14:ligatures w14:val="none"/>
+        </w:rPr>
+        <w:t xml:space="preserve">, J., … Yan, Z. (2026). Global phosphorus enrichment reshapes terrestrial phosphorus cycling. </w:t>
+      </w:r>
+      <w:r>
+        <w:rPr>
+          <w:rFonts w:eastAsia="Times New Roman"/>
+          <w:i/>
+          <w:iCs/>
+          <w:kern w:val="0"/>
+          <w14:ligatures w14:val="none"/>
+        </w:rPr>
+        <w:t>Global Change Biology</w:t>
+      </w:r>
+      <w:r>
+        <w:rPr>
+          <w:rFonts w:eastAsia="Times New Roman"/>
+          <w:kern w:val="0"/>
+          <w14:ligatures w14:val="none"/>
+        </w:rPr>
+        <w:t xml:space="preserve">, </w:t>
+      </w:r>
+      <w:r>
+        <w:rPr>
+          <w:rFonts w:eastAsia="Times New Roman"/>
+          <w:i/>
+          <w:iCs/>
+          <w:kern w:val="0"/>
+          <w14:ligatures w14:val="none"/>
+        </w:rPr>
+        <w:t>32</w:t>
+      </w:r>
+      <w:r>
+        <w:rPr>
+          <w:rFonts w:eastAsia="Times New Roman"/>
+          <w:kern w:val="0"/>
+          <w14:ligatures w14:val="none"/>
+        </w:rPr>
+        <w:t xml:space="preserve">(4), e70827. </w:t>
+      </w:r>
+      <w:hyperlink r:id="rId7" w:history="1">
+        <w:r>
+          <w:rPr>
+            <w:rStyle w:val="Hyperlink"/>
+            <w:rFonts w:eastAsia="Times New Roman"/>
+            <w:kern w:val="0"/>
+            <w14:ligatures w14:val="none"/>
+          </w:rPr>
+          <w:t>https://doi.org/10.1111/gcb.70827</w:t>
+        </w:r>
+      </w:hyperlink>
+    </w:p>
+    <w:p>
+      <w:pPr>
+        <w:rPr>
+          <w:color w:val="000000"/>
+        </w:rPr>
+      </w:pPr>
+    </w:p>
+    <w:p>
+      <w:pPr>
+        <w:pStyle w:val="ListParagraph"/>
+        <w:numPr>
+          <w:ilvl w:val="0"/>
+          <w:numId w:val="2"/>
+        </w:numPr>
+        <w:rPr>
+          <w:color w:val="000000"/>
+        </w:rPr>
+      </w:pPr>
+      <w:r>
+        <w:rPr>
+          <w:color w:val="000000"/>
+        </w:rPr>
+        <w:t>Provide the name and institutional email addresses of five potential reviewers.</w:t>
+      </w:r>
+    </w:p>
+    <w:p>
+      <w:pPr>
+        <w:spacing w:after="0" w:line="240" w:lineRule="auto"/>
+        <w:rPr>
+          <w:rStyle w:val="accordion-tabbedtab-mobile"/>
+        </w:rPr>
+      </w:pPr>
+      <w:proofErr w:type="spellStart"/>
+      <w:r>
+        <w:rPr>
+          <w:rFonts w:eastAsia="Times New Roman"/>
+          <w:kern w:val="0"/>
+          <w14:ligatures w14:val="none"/>
+        </w:rPr>
+        <w:t>Enzai</w:t>
+      </w:r>
+      <w:proofErr w:type="spellEnd"/>
+      <w:r>
+        <w:rPr>
+          <w:rFonts w:eastAsia="Times New Roman"/>
+          <w:kern w:val="0"/>
+          <w14:ligatures w14:val="none"/>
+        </w:rPr>
+        <w:t xml:space="preserve"> Du </w:t>
+      </w:r>
+      <w:r>
+        <w:rPr>
+          <w:rFonts w:eastAsia="Times New Roman"/>
+          <w:kern w:val="0"/>
+          <w14:ligatures w14:val="none"/>
+        </w:rPr>
+        <w:t>–</w:t>
+      </w:r>
+      <w:r>
+        <w:rPr>
+          <w:rFonts w:eastAsia="Times New Roman"/>
+          <w:kern w:val="0"/>
+          <w14:ligatures w14:val="none"/>
+        </w:rPr>
+        <w:t xml:space="preserve"> </w:t>
+      </w:r>
+      <w:hyperlink r:id="rId8" w:tooltip="Link to email address" w:history="1">
+        <w:r>
+          <w:rPr>
+            <w:rStyle w:val="Hyperlink"/>
+          </w:rPr>
+          <w:t>enzaidu@bnu.edu.cn</w:t>
+        </w:r>
+      </w:hyperlink>
+    </w:p>
+    <w:p>
+      <w:pPr>
+        <w:spacing w:after="0" w:line="240" w:lineRule="auto"/>
+        <w:rPr>
+          <w:rStyle w:val="accordion-tabbedtab-mobile"/>
+        </w:rPr>
+      </w:pPr>
+      <w:r>
+        <w:rPr>
+          <w:rStyle w:val="accordion-tabbedtab-mobile"/>
+        </w:rPr>
+        <w:t xml:space="preserve">Adrienne Keller </w:t>
+      </w:r>
+      <w:r>
+        <w:rPr>
+          <w:rStyle w:val="accordion-tabbedtab-mobile"/>
+        </w:rPr>
+        <w:t>–</w:t>
+      </w:r>
+      <w:r>
+        <w:rPr>
+          <w:rStyle w:val="accordion-tabbedtab-mobile"/>
+        </w:rPr>
+        <w:t xml:space="preserve"> </w:t>
+      </w:r>
+      <w:hyperlink r:id="rId9" w:tgtFrame="_self" w:history="1">
+        <w:r>
+          <w:rPr>
+            <w:rStyle w:val="Hyperlink"/>
+          </w:rPr>
+          <w:t>kellerab@mtu.edu</w:t>
+        </w:r>
+      </w:hyperlink>
+    </w:p>
+    <w:p>
+      <w:pPr>
+        <w:spacing w:after="0" w:line="240" w:lineRule="auto"/>
+        <w:rPr>
+          <w:rFonts w:eastAsia="Times New Roman"/>
+          <w:kern w:val="0"/>
+          <w14:ligatures w14:val="none"/>
+        </w:rPr>
+      </w:pPr>
+      <w:r>
+        <w:rPr>
+          <w:rFonts w:eastAsia="Times New Roman"/>
+          <w:kern w:val="0"/>
+          <w14:ligatures w14:val="none"/>
+        </w:rPr>
+        <w:t xml:space="preserve">Sian Kou-Giesbrecht – </w:t>
+      </w:r>
+      <w:hyperlink r:id="rId10" w:history="1">
+        <w:r>
+          <w:rPr>
+            <w:rStyle w:val="Hyperlink"/>
+            <w:rFonts w:eastAsia="Times New Roman"/>
+            <w:kern w:val="0"/>
+            <w14:ligatures w14:val="none"/>
+          </w:rPr>
+          <w:t>sian_kou-giesbrecht@sfu.ca</w:t>
+        </w:r>
+      </w:hyperlink>
+    </w:p>
+    <w:p>
+      <w:pPr>
+        <w:spacing w:after="0" w:line="240" w:lineRule="auto"/>
+        <w:rPr>
+          <w:rFonts w:eastAsia="Times New Roman"/>
+          <w:kern w:val="0"/>
+          <w14:ligatures w14:val="none"/>
+        </w:rPr>
+      </w:pPr>
+      <w:proofErr w:type="spellStart"/>
+      <w:r>
+        <w:rPr>
+          <w:rFonts w:eastAsia="Times New Roman"/>
+          <w:kern w:val="0"/>
+          <w14:ligatures w14:val="none"/>
+        </w:rPr>
+        <w:t>Ashehad</w:t>
+      </w:r>
+      <w:proofErr w:type="spellEnd"/>
+      <w:r>
+        <w:rPr>
+          <w:rFonts w:eastAsia="Times New Roman"/>
+          <w:kern w:val="0"/>
+          <w14:ligatures w14:val="none"/>
+        </w:rPr>
+        <w:t xml:space="preserve"> A. Ali</w:t>
+      </w:r>
+      <w:r>
+        <w:rPr>
+          <w:rFonts w:eastAsia="Times New Roman"/>
+          <w:kern w:val="0"/>
+          <w14:ligatures w14:val="none"/>
+        </w:rPr>
+        <w:t xml:space="preserve"> – </w:t>
+      </w:r>
+      <w:hyperlink r:id="rId11" w:history="1">
+        <w:r>
+          <w:rPr>
+            <w:rStyle w:val="Hyperlink"/>
+            <w:rFonts w:eastAsia="Times New Roman"/>
+            <w:kern w:val="0"/>
+            <w14:ligatures w14:val="none"/>
+          </w:rPr>
+          <w:t>ali.ashehad@gmail.com</w:t>
+        </w:r>
+      </w:hyperlink>
+    </w:p>
+    <w:p>
+      <w:pPr>
+        <w:spacing w:after="0" w:line="240" w:lineRule="auto"/>
+        <w:rPr>
+          <w:rStyle w:val="accordion-tabbedtab-mobile"/>
+        </w:rPr>
+      </w:pPr>
+      <w:proofErr w:type="spellStart"/>
+      <w:r>
+        <w:t>Xingyun</w:t>
+      </w:r>
+      <w:proofErr w:type="spellEnd"/>
+      <w:r>
+        <w:t xml:space="preserve"> Liang</w:t>
+      </w:r>
+      <w:r>
+        <w:t xml:space="preserve"> – </w:t>
+      </w:r>
+      <w:hyperlink r:id="rId12" w:tooltip="Link to email address" w:history="1">
+        <w:r>
+          <w:rPr>
+            <w:rStyle w:val="Hyperlink"/>
+          </w:rPr>
+          <w:t>liangxingyun@scbg.ac.cn</w:t>
+        </w:r>
+      </w:hyperlink>
+    </w:p>
+    <w:p>
+      <w:pPr>
+        <w:spacing w:after="0" w:line="240" w:lineRule="auto"/>
+        <w:rPr>
+          <w:rFonts w:eastAsia="Times New Roman"/>
+          <w:kern w:val="0"/>
+          <w14:ligatures w14:val="none"/>
         </w:rPr>
       </w:pPr>
     </w:p>
@@ -1524,7 +1693,6 @@
   <w:style w:type="character" w:default="1" w:styleId="DefaultParagraphFont">
     <w:name w:val="Default Paragraph Font"/>
     <w:uiPriority w:val="1"/>
-    <w:semiHidden/>
     <w:unhideWhenUsed/>
   </w:style>
   <w:style w:type="table" w:default="1" w:styleId="TableNormal">
@@ -1871,6 +2039,16 @@
       <w:i/>
       <w:iCs/>
     </w:rPr>
+  </w:style>
+  <w:style w:type="character" w:customStyle="1" w:styleId="accordion-tabbedtab-mobile">
+    <w:name w:val="accordion-tabbed__tab-mobile"/>
+    <w:basedOn w:val="DefaultParagraphFont"/>
+    <w:rsid w:val="000B16CD"/>
+  </w:style>
+  <w:style w:type="character" w:customStyle="1" w:styleId="c9dxtc">
+    <w:name w:val="c9dxtc"/>
+    <w:basedOn w:val="DefaultParagraphFont"/>
+    <w:rsid w:val="00BB6889"/>
   </w:style>
 </w:styles>
 </file>

</xml_diff>